<commit_message>
Apply Ahmed's confirmations: salary floor, mentoring/coaching bullets, TICO, dates
Co-Authored-By: Claude Sonnet 5.5 <noreply@anthropic.com>
Claude-Session: https://claude.ai/code/session_01DGBu3QZtcRHgxaxddyJaKV
</commit_message>
<xml_diff>
--- a/resume/output/Ahmed_Essam_Ali_Resume.docx
+++ b/resume/output/Ahmed_Essam_Ali_Resume.docx
@@ -147,7 +147,7 @@
         </w:rPr>
         <w:t>•</w:t>
         <w:tab/>
-        <w:t>Lead a 2,100+ employee multi-line operation through 3 Contact Center Managers, owning client relationship, P&amp;L, SLAs and quarterly business reviews.</w:t>
+        <w:t>Lead a 2,100+ employee multi-line operation serving the US market through 3 Contact Center Managers, owning client relationship, P&amp;L, SLAs and quarterly business reviews.</w:t>
       </w:r>
     </w:p>
     <w:p>
@@ -205,6 +205,25 @@
         <w:t>•</w:t>
         <w:tab/>
         <w:t>Deployed GenAI agent-assist chatbots and automation tools, replacing 50% of support coaches needed for nesting during speed-to-proficiency.</w:t>
+      </w:r>
+    </w:p>
+    <w:p>
+      <w:pPr>
+        <w:tabs>
+          <w:tab w:pos="360" w:val="left"/>
+        </w:tabs>
+        <w:spacing w:before="0" w:after="40" w:line="240" w:lineRule="auto"/>
+        <w:ind w:left="360" w:hanging="259"/>
+      </w:pPr>
+      <w:r>
+        <w:rPr>
+          <w:rFonts w:ascii="Calibri" w:hAnsi="Calibri" w:cs="Calibri" w:eastAsia="Calibri"/>
+          <w:b w:val="0"/>
+          <w:sz w:val="21"/>
+        </w:rPr>
+        <w:t>•</w:t>
+        <w:tab/>
+        <w:t>Mentored 6 Operations Managers through the GROW program (20+ workshops).</w:t>
       </w:r>
     </w:p>
     <w:p>
@@ -428,6 +447,25 @@
         <w:t>•</w:t>
         <w:tab/>
         <w:t>Launched one of the largest e-commerce programs in MENA, ramping 400+ agents in one quarter with all KPIs green from go-live.</w:t>
+      </w:r>
+    </w:p>
+    <w:p>
+      <w:pPr>
+        <w:tabs>
+          <w:tab w:pos="360" w:val="left"/>
+        </w:tabs>
+        <w:spacing w:before="0" w:after="40" w:line="240" w:lineRule="auto"/>
+        <w:ind w:left="360" w:hanging="259"/>
+      </w:pPr>
+      <w:r>
+        <w:rPr>
+          <w:rFonts w:ascii="Calibri" w:hAnsi="Calibri" w:cs="Calibri" w:eastAsia="Calibri"/>
+          <w:b w:val="0"/>
+          <w:sz w:val="21"/>
+        </w:rPr>
+        <w:t>•</w:t>
+        <w:tab/>
+        <w:t>Coached 11 supervisors through Educational Learning Plans.</w:t>
       </w:r>
     </w:p>
     <w:p>
@@ -946,6 +984,22 @@
           <w:b w:val="0"/>
           <w:sz w:val="21"/>
         </w:rPr>
+        <w:t>TICO Certification</w:t>
+      </w:r>
+    </w:p>
+    <w:p>
+      <w:pPr>
+        <w:tabs>
+          <w:tab w:pos="10368" w:val="right"/>
+        </w:tabs>
+        <w:spacing w:before="0" w:after="30" w:line="240" w:lineRule="auto"/>
+      </w:pPr>
+      <w:r>
+        <w:rPr>
+          <w:rFonts w:ascii="Calibri" w:hAnsi="Calibri" w:cs="Calibri" w:eastAsia="Calibri"/>
+          <w:b w:val="0"/>
+          <w:sz w:val="21"/>
+        </w:rPr>
         <w:t>Data Analysis Nanodegree, Udacity</w:t>
       </w:r>
       <w:r>
@@ -972,6 +1026,15 @@
           <w:sz w:val="21"/>
         </w:rPr>
         <w:t>Web Development Professional Nanodegree, Udacity</w:t>
+      </w:r>
+      <w:r>
+        <w:rPr>
+          <w:rFonts w:ascii="Calibri" w:hAnsi="Calibri" w:cs="Calibri" w:eastAsia="Calibri"/>
+          <w:b w:val="0"/>
+          <w:sz w:val="21"/>
+        </w:rPr>
+        <w:tab/>
+        <w:t>2021</w:t>
       </w:r>
     </w:p>
     <w:p>

</xml_diff>

<commit_message>
Add 42.6% growth bullet, TICO date; clear needs_confirmation
Co-Authored-By: Claude Sonnet 5.5 <noreply@anthropic.com>
Claude-Session: https://claude.ai/code/session_01DGBu3QZtcRHgxaxddyJaKV
</commit_message>
<xml_diff>
--- a/resume/output/Ahmed_Essam_Ali_Resume.docx
+++ b/resume/output/Ahmed_Essam_Ali_Resume.docx
@@ -205,6 +205,25 @@
         <w:t>•</w:t>
         <w:tab/>
         <w:t>Deployed GenAI agent-assist chatbots and automation tools, replacing 50% of support coaches needed for nesting during speed-to-proficiency.</w:t>
+      </w:r>
+    </w:p>
+    <w:p>
+      <w:pPr>
+        <w:tabs>
+          <w:tab w:pos="360" w:val="left"/>
+        </w:tabs>
+        <w:spacing w:before="0" w:after="40" w:line="240" w:lineRule="auto"/>
+        <w:ind w:left="360" w:hanging="259"/>
+      </w:pPr>
+      <w:r>
+        <w:rPr>
+          <w:rFonts w:ascii="Calibri" w:hAnsi="Calibri" w:cs="Calibri" w:eastAsia="Calibri"/>
+          <w:b w:val="0"/>
+          <w:sz w:val="21"/>
+        </w:rPr>
+        <w:t>•</w:t>
+        <w:tab/>
+        <w:t>Grew revenue 42.6% on the US telecommunications account.</w:t>
       </w:r>
     </w:p>
     <w:p>
@@ -986,6 +1005,15 @@
         </w:rPr>
         <w:t>TICO Certification</w:t>
       </w:r>
+      <w:r>
+        <w:rPr>
+          <w:rFonts w:ascii="Calibri" w:hAnsi="Calibri" w:cs="Calibri" w:eastAsia="Calibri"/>
+          <w:b w:val="0"/>
+          <w:sz w:val="21"/>
+        </w:rPr>
+        <w:tab/>
+        <w:t>2014</w:t>
+      </w:r>
     </w:p>
     <w:p>
       <w:pPr>

</xml_diff>